<commit_message>
update autobin set from Jared Sealy
</commit_message>
<xml_diff>
--- a/IVIM-AUTOBINNED-PIPELINE-STAR-3-3-2026.docx
+++ b/IVIM-AUTOBINNED-PIPELINE-STAR-3-3-2026.docx
@@ -520,10 +520,10 @@
         <mc:AlternateContent xmlns:mc="http://schemas.openxmlformats.org/markup-compatibility/2006">
           <mc:Choice xmlns:mc="http://schemas.openxmlformats.org/markup-compatibility/2006" Requires="wpg">
             <w:drawing xmlns:w="http://schemas.openxmlformats.org/wordprocessingml/2006/main">
-              <wp:inline xmlns:wp="http://schemas.openxmlformats.org/drawingml/2006/wordprocessingDrawing" xmlns:wp14="http://schemas.microsoft.com/office/word/2010/wordprocessingDrawing" distT="0" distB="0" distL="0" distR="0" wp14:anchorId="0C0BA1F1" wp14:editId="396CE7D8">
+              <wp:inline xmlns:wp="http://schemas.openxmlformats.org/drawingml/2006/wordprocessingDrawing" xmlns:wp14="http://schemas.microsoft.com/office/word/2010/wordprocessingDrawing" distT="0" distB="0" distL="0" distR="0" wp14:anchorId="1E67739C" wp14:editId="4012047A">
                 <wp:extent xmlns:wp="http://schemas.openxmlformats.org/drawingml/2006/wordprocessingDrawing" cx="4762500" cy="304800"/>
                 <wp:effectExtent xmlns:wp="http://schemas.openxmlformats.org/drawingml/2006/wordprocessingDrawing" l="0" t="0" r="0" b="0"/>
-                <wp:docPr xmlns:wp="http://schemas.openxmlformats.org/drawingml/2006/wordprocessingDrawing" id="717700182" name="Group 1"/>
+                <wp:docPr xmlns:wp="http://schemas.openxmlformats.org/drawingml/2006/wordprocessingDrawing" id="894292417" name="Group 1"/>
                 <wp:cNvGraphicFramePr xmlns:wp="http://schemas.openxmlformats.org/drawingml/2006/wordprocessingDrawing"/>
                 <a:graphic xmlns:a="http://schemas.openxmlformats.org/drawingml/2006/main">
                   <a:graphicData uri="http://schemas.microsoft.com/office/word/2010/wordprocessingGroup">
@@ -659,7 +659,7 @@
       </w:pPr>
       <w:r>
         <w:drawing>
-          <wp:inline wp14:editId="43E10F2C" wp14:anchorId="6582FAD6">
+          <wp:inline wp14:editId="7635B4E1" wp14:anchorId="6582FAD6">
             <wp:extent cx="5715000" cy="1743075"/>
             <wp:effectExtent l="0" t="0" r="0" b="0"/>
             <wp:docPr id="1102572093" name="drawing"/>
@@ -752,18 +752,13 @@
         <w:bidi w:val="0"/>
         <w:spacing w:before="0" w:beforeAutospacing="off" w:after="0" w:afterAutospacing="off"/>
         <w:ind w:left="720"/>
-        <w:rPr>
-          <w:rFonts w:ascii="Arial" w:hAnsi="Arial" w:eastAsia="Arial" w:cs="Arial"/>
-          <w:sz w:val="24"/>
-          <w:szCs w:val="24"/>
-        </w:rPr>
       </w:pPr>
       <w:r>
         <w:drawing>
-          <wp:inline wp14:editId="037297C9" wp14:anchorId="1F7B8F5F">
-            <wp:extent cx="5715000" cy="952500"/>
+          <wp:inline wp14:editId="58ECDC2F" wp14:anchorId="35756D27">
+            <wp:extent cx="5943600" cy="990600"/>
             <wp:effectExtent l="0" t="0" r="0" b="0"/>
-            <wp:docPr id="890757267" name="drawing"/>
+            <wp:docPr id="783073163" name="drawing"/>
             <wp:cNvGraphicFramePr>
               <a:graphicFrameLocks noChangeAspect="1"/>
             </wp:cNvGraphicFramePr>
@@ -771,11 +766,11 @@
               <a:graphicData xmlns:a="http://schemas.openxmlformats.org/drawingml/2006/main" uri="http://schemas.openxmlformats.org/drawingml/2006/picture">
                 <pic:pic xmlns:pic="http://schemas.openxmlformats.org/drawingml/2006/picture">
                   <pic:nvPicPr>
-                    <pic:cNvPr id="890757267" name="Picture 890757267"/>
+                    <pic:cNvPr id="783073163" name="Picture 783073163"/>
                     <pic:cNvPicPr/>
                   </pic:nvPicPr>
                   <pic:blipFill>
-                    <a:blip xmlns:r="http://schemas.openxmlformats.org/officeDocument/2006/relationships" r:embed="rId1418162842">
+                    <a:blip xmlns:r="http://schemas.openxmlformats.org/officeDocument/2006/relationships" r:embed="rId16709002">
                       <a:extLst>
                         <a:ext uri="{28A0092B-C50C-407E-A947-70E740481C1C}">
                           <a14:useLocalDpi xmlns:a14="http://schemas.microsoft.com/office/drawing/2010/main"/>
@@ -789,7 +784,7 @@
                   <pic:spPr>
                     <a:xfrm>
                       <a:off x="0" y="0"/>
-                      <a:ext cx="5715000" cy="952500"/>
+                      <a:ext cx="5943600" cy="990600"/>
                     </a:xfrm>
                     <a:prstGeom prst="rect">
                       <a:avLst/>
@@ -1261,7 +1256,7 @@
         </w:rPr>
         <w:t xml:space="preserve">The following steps use code run in MATLAB R2024b. See here for used code: </w:t>
       </w:r>
-      <w:hyperlink r:id="R6350676954a04558">
+      <w:hyperlink r:id="R37b4870c57344041">
         <w:r>
           <w:rPr>
             <w:rStyle w:val="Hyperlink"/>
@@ -1395,7 +1390,7 @@
         </w:rPr>
         <w:t xml:space="preserve"> You can now follow the original pipeline document from step 5 onward: </w:t>
       </w:r>
-      <w:hyperlink r:id="Rf7be70820a72447e">
+      <w:hyperlink r:id="Rd57a0ea6d7a44ea8">
         <w:r>
           <w:rPr>
             <w:rStyle w:val="Hyperlink"/>
@@ -2086,7 +2081,7 @@
     <w:name w:val="List Paragraph"/>
     <w:basedOn w:val="Normal"/>
     <w:qFormat/>
-    <w:rsid w:val="5DF2F717"/>
+    <w:rsid w:val="3F9263B1"/>
     <w:pPr>
       <w:spacing/>
       <w:ind w:left="720"/>
@@ -2098,7 +2093,7 @@
     <w:name w:val="Hyperlink"/>
     <w:basedOn w:val="DefaultParagraphFont"/>
     <w:unhideWhenUsed/>
-    <w:rsid w:val="5DF2F717"/>
+    <w:rsid w:val="3F9263B1"/>
     <w:rPr>
       <w:color w:val="467886"/>
       <w:u w:val="single"/>

</xml_diff>